<commit_message>
chore(sync): update 35 file(s) [.gitignore, CHANGELOG.md, CITATION.cff, data, docs, methodology, outputs, README.md, reviews, scripts, tools]
Automated settle-aware sync of the knowledge base.

Co-Authored-By: Claude Opus 4.8 <noreply@anthropic.com>
</commit_message>
<xml_diff>
--- a/outputs/Cross_mechanism_synthesis.docx
+++ b/outputs/Cross_mechanism_synthesis.docx
@@ -2,6 +2,32 @@
 <file path=word/document.xml><?xml version="1.0" encoding="utf-8"?>
 <w:document xmlns:w="http://schemas.openxmlformats.org/wordprocessingml/2006/main" xmlns:m="http://schemas.openxmlformats.org/officeDocument/2006/math" xmlns:r="http://schemas.openxmlformats.org/officeDocument/2006/relationships" xmlns:o="urn:schemas-microsoft-com:office:office" xmlns:v="urn:schemas-microsoft-com:vml" xmlns:w10="urn:schemas-microsoft-com:office:word" xmlns:a="http://schemas.openxmlformats.org/drawingml/2006/main" xmlns:pic="http://schemas.openxmlformats.org/drawingml/2006/picture" xmlns:wp="http://schemas.openxmlformats.org/drawingml/2006/wordprocessingDrawing">
   <w:body>
+    <w:sdt>
+      <w:sdtPr>
+        <w:docPartObj>
+          <w:docPartGallery w:val="Table of Contents"/>
+          <w:docPartUnique/>
+        </w:docPartObj>
+      </w:sdtPr>
+      <w:sdtContent>
+        <w:p>
+          <w:pPr>
+            <w:pStyle w:val="TOCHeading"/>
+          </w:pPr>
+          <w:r>
+            <w:t xml:space="preserve">Table of Contents</w:t>
+          </w:r>
+        </w:p>
+        <w:p>
+          <w:r>
+            <w:fldChar w:fldCharType="begin" w:dirty="true"/>
+            <w:instrText xml:space="preserve">TOC \o "1-3" \h \z \u</w:instrText>
+            <w:fldChar w:fldCharType="separate"/>
+            <w:fldChar w:fldCharType="end"/>
+          </w:r>
+        </w:p>
+      </w:sdtContent>
+    </w:sdt>
     <w:p>
       <w:pPr>
         <w:pStyle w:val="Heading1"/>
@@ -29,7 +55,7 @@
         <w:t xml:space="preserve"> </w:t>
       </w:r>
       <w:r>
-        <w:t xml:space="preserve">within a 229-paper corpus now coded on all three axes. Companion file:</w:t>
+        <w:t xml:space="preserve">within a 228-paper corpus now coded on all three axes. Companion file:</w:t>
       </w:r>
       <w:r>
         <w:t xml:space="preserve"> </w:t>
@@ -199,18 +225,18 @@
               <w:jc w:val="left"/>
             </w:pPr>
             <w:r>
-              <w:t xml:space="preserve">48</w:t>
-            </w:r>
-          </w:p>
-        </w:tc>
-        <w:tc>
-          <w:p>
-            <w:pPr>
-              <w:pStyle w:val="Compact"/>
-              <w:jc w:val="left"/>
-            </w:pPr>
-            <w:r>
-              <w:t xml:space="preserve">25 (10 simulated + 15 field)</w:t>
+              <w:t xml:space="preserve">47</w:t>
+            </w:r>
+          </w:p>
+        </w:tc>
+        <w:tc>
+          <w:p>
+            <w:pPr>
+              <w:pStyle w:val="Compact"/>
+              <w:jc w:val="left"/>
+            </w:pPr>
+            <w:r>
+              <w:t xml:space="preserve">24 (9 simulated + 15 field)</w:t>
             </w:r>
           </w:p>
         </w:tc>
@@ -1855,7 +1881,7 @@
         <w:t xml:space="preserve"> </w:t>
       </w:r>
       <w:r>
-        <w:t xml:space="preserve">(all 229 rows Verified; the 97 field/numerical</w:t>
+        <w:t xml:space="preserve">(all 228 rows Verified; the 97 field/numerical</w:t>
       </w:r>
       <w:r>
         <w:t xml:space="preserve"> </w:t>
@@ -1885,7 +1911,7 @@
         <w:t xml:space="preserve"> </w:t>
       </w:r>
       <w:r>
-        <w:t xml:space="preserve">span several taxa,</w:t>
+        <w:t xml:space="preserve">span several taxa, environments and timing classes.</w:t>
       </w:r>
     </w:p>
     <w:sectPr/>

</xml_diff>